<commit_message>
docs: update client checklist — cookie banner implemented, office address check
Section 4 now describes the implemented bottom banner (map after accept,
address placeholder, footer settings) and asks only about analytics.
New check: is Tatay András utca 10. also the registered seat.

Co-Authored-By: Claude Opus 5.5 <noreply@anthropic.com>
</commit_message>
<xml_diff>
--- a/docs/Adatvedelem-es-impresszum-atnezes.docx
+++ b/docs/Adatvedelem-es-impresszum-atnezes.docx
@@ -229,7 +229,7 @@
                 <w:sz w:val="22"/>
                 <w:szCs w:val="22"/>
               </w:rPr>
-              <w:t xml:space="preserve"> – 8 állítást az iroda működéséről (pl. meddig őrizzük az ajánlatkéréseket). Elég jelölnie, ha valami nem így van. → 2. fejezet</w:t>
+              <w:t xml:space="preserve"> – 9 állítást az iroda működéséről (pl. meddig őrizzük az ajánlatkéréseket). Elég jelölnie, ha valami nem így van. → 2. fejezet</w:t>
             </w:r>
           </w:p>
           <w:p>
@@ -244,7 +244,7 @@
                 <w:sz w:val="22"/>
                 <w:szCs w:val="22"/>
               </w:rPr>
-              <w:t xml:space="preserve">3. Döntenie kell</w:t>
+              <w:t xml:space="preserve">3. Sütik – már elkészült</w:t>
             </w:r>
             <w:r>
               <w:rPr>
@@ -252,7 +252,7 @@
                 <w:sz w:val="22"/>
                 <w:szCs w:val="22"/>
               </w:rPr>
-              <w:t xml:space="preserve"> – egy kérdésben: legyen-e „Elfogadom” süti-ablak az oldalon. Javaslatunk: nem kell. → 4. fejezet</w:t>
+              <w:t xml:space="preserve"> – az oldal alján megjelenő süti-sáv szabályosan kezeli a térképet. Döntenie csak arról kell, kérnek-e látogatottság-mérést. → 4. fejezet</w:t>
             </w:r>
           </w:p>
           <w:p>
@@ -2183,7 +2183,7 @@
                 <w:sz w:val="20"/>
                 <w:szCs w:val="20"/>
               </w:rPr>
-              <w:t xml:space="preserve">A tájékoztató </w:t>
+              <w:t xml:space="preserve">Székhely és ügyfélfogadás: </w:t>
             </w:r>
             <w:r>
               <w:rPr>
@@ -2193,6 +2193,110 @@
                 <w:sz w:val="20"/>
                 <w:szCs w:val="20"/>
               </w:rPr>
+              <w:t xml:space="preserve">6000 Kecskemét, Tatay András utca 10.</w:t>
+            </w:r>
+          </w:p>
+        </w:tc>
+        <w:tc>
+          <w:tcPr>
+            <w:tcW w:type="dxa" w:w="3700"/>
+            <w:tcBorders>
+              <w:top w:val="single" w:color="D0D5DD" w:sz="4"/>
+              <w:left w:val="single" w:color="D0D5DD" w:sz="4"/>
+              <w:bottom w:val="single" w:color="D0D5DD" w:sz="4"/>
+              <w:right w:val="single" w:color="D0D5DD" w:sz="4"/>
+            </w:tcBorders>
+            <w:shd w:fill="F5F7FA" w:color="auto" w:val="clear"/>
+            <w:tcMar>
+              <w:top w:type="dxa" w:w="90"/>
+              <w:left w:type="dxa" w:w="120"/>
+              <w:bottom w:type="dxa" w:w="90"/>
+              <w:right w:type="dxa" w:w="120"/>
+            </w:tcMar>
+          </w:tcPr>
+          <w:p>
+            <w:pPr>
+              <w:spacing w:after="40" w:line="264"/>
+            </w:pPr>
+            <w:r>
+              <w:rPr>
+                <w:rFonts w:ascii="Calibri" w:cs="Calibri" w:eastAsia="Calibri" w:hAnsi="Calibri"/>
+                <w:sz w:val="20"/>
+                <w:szCs w:val="20"/>
+              </w:rPr>
+              <w:t xml:space="preserve">Ez a cégjegyzékben (nyilvántartásban) szereplő székhely is? Ha nem, kérjük, adja meg a hivatalos székhelyet.</w:t>
+            </w:r>
+          </w:p>
+        </w:tc>
+        <w:tc>
+          <w:tcPr>
+            <w:tcW w:type="dxa" w:w="1638"/>
+            <w:tcBorders>
+              <w:top w:val="single" w:color="D0D5DD" w:sz="4"/>
+              <w:left w:val="single" w:color="D0D5DD" w:sz="4"/>
+              <w:bottom w:val="single" w:color="D0D5DD" w:sz="4"/>
+              <w:right w:val="single" w:color="D0D5DD" w:sz="4"/>
+            </w:tcBorders>
+            <w:shd w:fill="F5F7FA" w:color="auto" w:val="clear"/>
+            <w:tcMar>
+              <w:top w:type="dxa" w:w="90"/>
+              <w:left w:type="dxa" w:w="120"/>
+              <w:bottom w:type="dxa" w:w="90"/>
+              <w:right w:type="dxa" w:w="120"/>
+            </w:tcMar>
+          </w:tcPr>
+          <w:p>
+            <w:pPr>
+              <w:spacing w:after="40" w:line="264"/>
+            </w:pPr>
+            <w:r>
+              <w:rPr>
+                <w:rFonts w:ascii="Calibri" w:cs="Calibri" w:eastAsia="Calibri" w:hAnsi="Calibri"/>
+                <w:sz w:val="20"/>
+                <w:szCs w:val="20"/>
+              </w:rPr>
+              <w:t xml:space="preserve">☐ igen   ☐ nem</w:t>
+            </w:r>
+          </w:p>
+        </w:tc>
+      </w:tr>
+      <w:tr>
+        <w:tc>
+          <w:tcPr>
+            <w:tcW w:type="dxa" w:w="4300"/>
+            <w:tcBorders>
+              <w:top w:val="single" w:color="D0D5DD" w:sz="4"/>
+              <w:left w:val="single" w:color="D0D5DD" w:sz="4"/>
+              <w:bottom w:val="single" w:color="D0D5DD" w:sz="4"/>
+              <w:right w:val="single" w:color="D0D5DD" w:sz="4"/>
+            </w:tcBorders>
+            <w:tcMar>
+              <w:top w:type="dxa" w:w="90"/>
+              <w:left w:type="dxa" w:w="120"/>
+              <w:bottom w:type="dxa" w:w="90"/>
+              <w:right w:type="dxa" w:w="120"/>
+            </w:tcMar>
+          </w:tcPr>
+          <w:p>
+            <w:pPr>
+              <w:spacing w:after="40" w:line="264"/>
+            </w:pPr>
+            <w:r>
+              <w:rPr>
+                <w:rFonts w:ascii="Calibri" w:cs="Calibri" w:eastAsia="Calibri" w:hAnsi="Calibri"/>
+                <w:sz w:val="20"/>
+                <w:szCs w:val="20"/>
+              </w:rPr>
+              <w:t xml:space="preserve">A tájékoztató </w:t>
+            </w:r>
+            <w:r>
+              <w:rPr>
+                <w:rFonts w:ascii="Calibri" w:cs="Calibri" w:eastAsia="Calibri" w:hAnsi="Calibri"/>
+                <w:b/>
+                <w:bCs/>
+                <w:sz w:val="20"/>
+                <w:szCs w:val="20"/>
+              </w:rPr>
               <w:t xml:space="preserve">hatálybalépésének dátuma</w:t>
             </w:r>
             <w:r>
@@ -2214,7 +2318,6 @@
               <w:bottom w:val="single" w:color="D0D5DD" w:sz="4"/>
               <w:right w:val="single" w:color="D0D5DD" w:sz="4"/>
             </w:tcBorders>
-            <w:shd w:fill="F5F7FA" w:color="auto" w:val="clear"/>
             <w:tcMar>
               <w:top w:type="dxa" w:w="90"/>
               <w:left w:type="dxa" w:w="120"/>
@@ -2245,7 +2348,6 @@
               <w:bottom w:val="single" w:color="D0D5DD" w:sz="4"/>
               <w:right w:val="single" w:color="D0D5DD" w:sz="4"/>
             </w:tcBorders>
-            <w:shd w:fill="F5F7FA" w:color="auto" w:val="clear"/>
             <w:tcMar>
               <w:top w:type="dxa" w:w="90"/>
               <w:left w:type="dxa" w:w="120"/>
@@ -2509,7 +2611,7 @@
           <w:sz w:val="30"/>
           <w:szCs w:val="30"/>
         </w:rPr>
-        <w:t xml:space="preserve">4. Kell-e „Elfogadom” süti-ablak az oldalra?</w:t>
+        <w:t xml:space="preserve">4. Sütik – így működik az oldalon</w:t>
       </w:r>
     </w:p>
     <w:tbl>
@@ -2558,7 +2660,20 @@
                 <w:sz w:val="24"/>
                 <w:szCs w:val="24"/>
               </w:rPr>
-              <w:t xml:space="preserve">Válasz röviden: nem kell – ha elfogadja az alábbi két apró műszaki módosítást.</w:t>
+              <w:t xml:space="preserve">Röviden: elkészült – csak egy kérdésben kérjük a döntését (a fejezet végén).</w:t>
+            </w:r>
+          </w:p>
+          <w:p>
+            <w:pPr>
+              <w:spacing w:after="80" w:line="276"/>
+            </w:pPr>
+            <w:r>
+              <w:rPr>
+                <w:rFonts w:ascii="Calibri" w:cs="Calibri" w:eastAsia="Calibri" w:hAnsi="Calibri"/>
+                <w:sz w:val="22"/>
+                <w:szCs w:val="22"/>
+              </w:rPr>
+              <w:t xml:space="preserve">Az oldal alján – a megszokott módon – süti-sáv jelenik meg. A térkép csak elfogadás után töltődik be, utána viszont mindenhol automatikusan látszik.</w:t>
             </w:r>
           </w:p>
         </w:tc>
@@ -2583,7 +2698,7 @@
           <w:sz w:val="24"/>
           <w:szCs w:val="24"/>
         </w:rPr>
-        <w:t xml:space="preserve">Mi a helyzet most</w:t>
+        <w:t xml:space="preserve">Mit lát a látogató</w:t>
       </w:r>
     </w:p>
     <w:p>
@@ -2598,28 +2713,74 @@
       <w:r>
         <w:rPr>
           <w:rFonts w:ascii="Calibri" w:cs="Calibri" w:eastAsia="Calibri" w:hAnsi="Calibri"/>
-          <w:sz w:val="22"/>
-          <w:szCs w:val="22"/>
-        </w:rPr>
-        <w:t xml:space="preserve">A weboldal </w:t>
-      </w:r>
-      <w:r>
-        <w:rPr>
-          <w:rFonts w:ascii="Calibri" w:cs="Calibri" w:eastAsia="Calibri" w:hAnsi="Calibri"/>
           <w:b/>
           <w:bCs/>
           <w:sz w:val="22"/>
           <w:szCs w:val="22"/>
         </w:rPr>
-        <w:t xml:space="preserve">nem használ</w:t>
-      </w:r>
-      <w:r>
-        <w:rPr>
-          <w:rFonts w:ascii="Calibri" w:cs="Calibri" w:eastAsia="Calibri" w:hAnsi="Calibri"/>
-          <w:sz w:val="22"/>
-          <w:szCs w:val="22"/>
-        </w:rPr>
-        <w:t xml:space="preserve"> látogatottság-mérő (pl. Google Analytics), hirdetési (pl. Facebook-pixel) vagy egyéb követő sütit.</w:t>
+        <w:t xml:space="preserve">Első látogatáskor</w:t>
+      </w:r>
+      <w:r>
+        <w:rPr>
+          <w:rFonts w:ascii="Calibri" w:cs="Calibri" w:eastAsia="Calibri" w:hAnsi="Calibri"/>
+          <w:sz w:val="22"/>
+          <w:szCs w:val="22"/>
+        </w:rPr>
+        <w:t xml:space="preserve"> az oldal alján egy sáv jelenik meg három gombbal: </w:t>
+      </w:r>
+      <w:r>
+        <w:rPr>
+          <w:rFonts w:ascii="Calibri" w:cs="Calibri" w:eastAsia="Calibri" w:hAnsi="Calibri"/>
+          <w:b/>
+          <w:bCs/>
+          <w:sz w:val="22"/>
+          <w:szCs w:val="22"/>
+        </w:rPr>
+        <w:t xml:space="preserve">Elfogadom</w:t>
+      </w:r>
+      <w:r>
+        <w:rPr>
+          <w:rFonts w:ascii="Calibri" w:cs="Calibri" w:eastAsia="Calibri" w:hAnsi="Calibri"/>
+          <w:sz w:val="22"/>
+          <w:szCs w:val="22"/>
+        </w:rPr>
+        <w:t xml:space="preserve">, </w:t>
+      </w:r>
+      <w:r>
+        <w:rPr>
+          <w:rFonts w:ascii="Calibri" w:cs="Calibri" w:eastAsia="Calibri" w:hAnsi="Calibri"/>
+          <w:b/>
+          <w:bCs/>
+          <w:sz w:val="22"/>
+          <w:szCs w:val="22"/>
+        </w:rPr>
+        <w:t xml:space="preserve">Csak a szükségesek</w:t>
+      </w:r>
+      <w:r>
+        <w:rPr>
+          <w:rFonts w:ascii="Calibri" w:cs="Calibri" w:eastAsia="Calibri" w:hAnsi="Calibri"/>
+          <w:sz w:val="22"/>
+          <w:szCs w:val="22"/>
+        </w:rPr>
+        <w:t xml:space="preserve">, </w:t>
+      </w:r>
+      <w:r>
+        <w:rPr>
+          <w:rFonts w:ascii="Calibri" w:cs="Calibri" w:eastAsia="Calibri" w:hAnsi="Calibri"/>
+          <w:b/>
+          <w:bCs/>
+          <w:sz w:val="22"/>
+          <w:szCs w:val="22"/>
+        </w:rPr>
+        <w:t xml:space="preserve">Beállítások</w:t>
+      </w:r>
+      <w:r>
+        <w:rPr>
+          <w:rFonts w:ascii="Calibri" w:cs="Calibri" w:eastAsia="Calibri" w:hAnsi="Calibri"/>
+          <w:sz w:val="22"/>
+          <w:szCs w:val="22"/>
+        </w:rPr>
+        <w:t xml:space="preserve">. A sáv nem takarja ki az oldalt, a tartalom mellette is olvasható.</w:t>
       </w:r>
     </w:p>
     <w:p>
@@ -2634,28 +2795,20 @@
       <w:r>
         <w:rPr>
           <w:rFonts w:ascii="Calibri" w:cs="Calibri" w:eastAsia="Calibri" w:hAnsi="Calibri"/>
-          <w:sz w:val="22"/>
-          <w:szCs w:val="22"/>
-        </w:rPr>
-        <w:t xml:space="preserve">Egyetlen elem helyez el sütit: a beágyazott </w:t>
-      </w:r>
-      <w:r>
-        <w:rPr>
-          <w:rFonts w:ascii="Calibri" w:cs="Calibri" w:eastAsia="Calibri" w:hAnsi="Calibri"/>
           <w:b/>
           <w:bCs/>
           <w:sz w:val="22"/>
           <w:szCs w:val="22"/>
         </w:rPr>
-        <w:t xml:space="preserve">Google térkép</w:t>
-      </w:r>
-      <w:r>
-        <w:rPr>
-          <w:rFonts w:ascii="Calibri" w:cs="Calibri" w:eastAsia="Calibri" w:hAnsi="Calibri"/>
-          <w:sz w:val="22"/>
-          <w:szCs w:val="22"/>
-        </w:rPr>
-        <w:t xml:space="preserve">. Ehhez jogszabály szerint a látogató előzetes hozzájárulása kellene – vagyis most egy süti-ablakra lenne szükség.</w:t>
+        <w:t xml:space="preserve">Elfogadás után</w:t>
+      </w:r>
+      <w:r>
+        <w:rPr>
+          <w:rFonts w:ascii="Calibri" w:cs="Calibri" w:eastAsia="Calibri" w:hAnsi="Calibri"/>
+          <w:sz w:val="22"/>
+          <w:szCs w:val="22"/>
+        </w:rPr>
+        <w:t xml:space="preserve"> az iroda helyét mutató Google térkép azonnal megjelenik, minden oldalon – külön kattintás nélkül.</w:t>
       </w:r>
     </w:p>
     <w:p>
@@ -2670,27 +2823,20 @@
       <w:r>
         <w:rPr>
           <w:rFonts w:ascii="Calibri" w:cs="Calibri" w:eastAsia="Calibri" w:hAnsi="Calibri"/>
-          <w:sz w:val="22"/>
-          <w:szCs w:val="22"/>
-        </w:rPr>
-        <w:t xml:space="preserve">A betűtípusok jelenleg a Google szerveréről töltődnek be. Ez sütit nem helyez el, de a látogató IP-címét továbbítja a Google-nek, amit adatvédelmi szempontból érdemes elkerülni.</w:t>
-      </w:r>
-    </w:p>
-    <w:p>
-      <w:pPr>
-        <w:pStyle w:val="Heading2"/>
-        <w:spacing w:after="120" w:before="240"/>
-      </w:pPr>
-      <w:r>
-        <w:rPr>
-          <w:rFonts w:ascii="Calibri" w:cs="Calibri" w:eastAsia="Calibri" w:hAnsi="Calibri"/>
           <w:b/>
           <w:bCs/>
-          <w:color w:val="1F3A5F"/>
-          <w:sz w:val="24"/>
-          <w:szCs w:val="24"/>
-        </w:rPr>
-        <w:t xml:space="preserve">Javaslatunk</w:t>
+          <w:sz w:val="22"/>
+          <w:szCs w:val="22"/>
+        </w:rPr>
+        <w:t xml:space="preserve">Visszatérő látogatónál</w:t>
+      </w:r>
+      <w:r>
+        <w:rPr>
+          <w:rFonts w:ascii="Calibri" w:cs="Calibri" w:eastAsia="Calibri" w:hAnsi="Calibri"/>
+          <w:sz w:val="22"/>
+          <w:szCs w:val="22"/>
+        </w:rPr>
+        <w:t xml:space="preserve"> 12 hónapig nem jelenik meg újra a sáv, a térkép rögtön látszik.</w:t>
       </w:r>
     </w:p>
     <w:p>
@@ -2710,15 +2856,15 @@
           <w:sz w:val="22"/>
           <w:szCs w:val="22"/>
         </w:rPr>
-        <w:t xml:space="preserve">Térkép kattintásra:</w:t>
-      </w:r>
-      <w:r>
-        <w:rPr>
-          <w:rFonts w:ascii="Calibri" w:cs="Calibri" w:eastAsia="Calibri" w:hAnsi="Calibri"/>
-          <w:sz w:val="22"/>
-          <w:szCs w:val="22"/>
-        </w:rPr>
-        <w:t xml:space="preserve"> a térkép helyén egy „Térkép megjelenítése” gomb lesz; a Google csak akkor töltődik be, ha a látogató rákattint. A cím és az útvonaltervezés linkje továbbra is azonnal látszik.</w:t>
+        <w:t xml:space="preserve">Ha valaki nem fogadja el</w:t>
+      </w:r>
+      <w:r>
+        <w:rPr>
+          <w:rFonts w:ascii="Calibri" w:cs="Calibri" w:eastAsia="Calibri" w:hAnsi="Calibri"/>
+          <w:sz w:val="22"/>
+          <w:szCs w:val="22"/>
+        </w:rPr>
+        <w:t xml:space="preserve">, a térkép helyén az iroda címe és egy útvonaltervező link áll, így a cím mindenképp elérhető.</w:t>
       </w:r>
     </w:p>
     <w:p>
@@ -2733,51 +2879,28 @@
       <w:r>
         <w:rPr>
           <w:rFonts w:ascii="Calibri" w:cs="Calibri" w:eastAsia="Calibri" w:hAnsi="Calibri"/>
+          <w:sz w:val="22"/>
+          <w:szCs w:val="22"/>
+        </w:rPr>
+        <w:t xml:space="preserve">A lap alján a </w:t>
+      </w:r>
+      <w:r>
+        <w:rPr>
+          <w:rFonts w:ascii="Calibri" w:cs="Calibri" w:eastAsia="Calibri" w:hAnsi="Calibri"/>
           <w:b/>
           <w:bCs/>
           <w:sz w:val="22"/>
           <w:szCs w:val="22"/>
         </w:rPr>
-        <w:t xml:space="preserve">Betűtípusok saját tárhelyről:</w:t>
-      </w:r>
-      <w:r>
-        <w:rPr>
-          <w:rFonts w:ascii="Calibri" w:cs="Calibri" w:eastAsia="Calibri" w:hAnsi="Calibri"/>
-          <w:sz w:val="22"/>
-          <w:szCs w:val="22"/>
-        </w:rPr>
-        <w:t xml:space="preserve"> a megjelenés nem változik, de a Google-hoz nem jut adat.</w:t>
-      </w:r>
-    </w:p>
-    <w:p>
-      <w:pPr>
-        <w:spacing w:after="120" w:line="288"/>
-      </w:pPr>
-      <w:r>
-        <w:rPr>
-          <w:rFonts w:ascii="Calibri" w:cs="Calibri" w:eastAsia="Calibri" w:hAnsi="Calibri"/>
-          <w:sz w:val="22"/>
-          <w:szCs w:val="22"/>
-        </w:rPr>
-        <w:t xml:space="preserve">Így az oldal </w:t>
-      </w:r>
-      <w:r>
-        <w:rPr>
-          <w:rFonts w:ascii="Calibri" w:cs="Calibri" w:eastAsia="Calibri" w:hAnsi="Calibri"/>
-          <w:b/>
-          <w:bCs/>
-          <w:sz w:val="22"/>
-          <w:szCs w:val="22"/>
-        </w:rPr>
-        <w:t xml:space="preserve">süti-ablak nélkül is megfelel</w:t>
-      </w:r>
-      <w:r>
-        <w:rPr>
-          <w:rFonts w:ascii="Calibri" w:cs="Calibri" w:eastAsia="Calibri" w:hAnsi="Calibri"/>
-          <w:sz w:val="22"/>
-          <w:szCs w:val="22"/>
-        </w:rPr>
-        <w:t xml:space="preserve"> a szabályoknak, a látogatókat pedig nem zavarja felugró ablak – egy könyvelőiroda oldalán ez a bizalom szempontjából is előnyös.</w:t>
+        <w:t xml:space="preserve">„Süti-beállítások”</w:t>
+      </w:r>
+      <w:r>
+        <w:rPr>
+          <w:rFonts w:ascii="Calibri" w:cs="Calibri" w:eastAsia="Calibri" w:hAnsi="Calibri"/>
+          <w:sz w:val="22"/>
+          <w:szCs w:val="22"/>
+        </w:rPr>
+        <w:t xml:space="preserve"> linken a döntés bármikor módosítható vagy visszavonható.</w:t>
       </w:r>
     </w:p>
     <w:p>
@@ -2794,20 +2917,7 @@
           <w:sz w:val="24"/>
           <w:szCs w:val="24"/>
         </w:rPr>
-        <w:t xml:space="preserve">Mikor lenne mégis szükség süti-ablakra?</w:t>
-      </w:r>
-    </w:p>
-    <w:p>
-      <w:pPr>
-        <w:spacing w:after="120" w:line="288"/>
-      </w:pPr>
-      <w:r>
-        <w:rPr>
-          <w:rFonts w:ascii="Calibri" w:cs="Calibri" w:eastAsia="Calibri" w:hAnsi="Calibri"/>
-          <w:sz w:val="22"/>
-          <w:szCs w:val="22"/>
-        </w:rPr>
-        <w:t xml:space="preserve">Ha később bármelyik az alábbiak közül felkerül az oldalra, előtte süti-ablakot is beépítünk:</w:t>
+        <w:t xml:space="preserve">Miért így</w:t>
       </w:r>
     </w:p>
     <w:p>
@@ -2825,7 +2935,25 @@
           <w:sz w:val="22"/>
           <w:szCs w:val="22"/>
         </w:rPr>
-        <w:t xml:space="preserve">látogatottság-mérés (Google Analytics vagy hasonló);</w:t>
+        <w:t xml:space="preserve">A beágyazott Google térkép betöltéskor sütiket helyez el. A jogszabályok szerint ehhez a látogató </w:t>
+      </w:r>
+      <w:r>
+        <w:rPr>
+          <w:rFonts w:ascii="Calibri" w:cs="Calibri" w:eastAsia="Calibri" w:hAnsi="Calibri"/>
+          <w:b/>
+          <w:bCs/>
+          <w:sz w:val="22"/>
+          <w:szCs w:val="22"/>
+        </w:rPr>
+        <w:t xml:space="preserve">előzetes hozzájárulása</w:t>
+      </w:r>
+      <w:r>
+        <w:rPr>
+          <w:rFonts w:ascii="Calibri" w:cs="Calibri" w:eastAsia="Calibri" w:hAnsi="Calibri"/>
+          <w:sz w:val="22"/>
+          <w:szCs w:val="22"/>
+        </w:rPr>
+        <w:t xml:space="preserve"> kell – ezért nem jelenhet meg a térkép az elfogadás előtt.</w:t>
       </w:r>
     </w:p>
     <w:p>
@@ -2843,7 +2971,25 @@
           <w:sz w:val="22"/>
           <w:szCs w:val="22"/>
         </w:rPr>
-        <w:t xml:space="preserve">Facebook-, Google- vagy egyéb hirdetéskövetés;</w:t>
+        <w:t xml:space="preserve">Az „Elfogadom” és a „Csak a szükségesek” gomb </w:t>
+      </w:r>
+      <w:r>
+        <w:rPr>
+          <w:rFonts w:ascii="Calibri" w:cs="Calibri" w:eastAsia="Calibri" w:hAnsi="Calibri"/>
+          <w:b/>
+          <w:bCs/>
+          <w:sz w:val="22"/>
+          <w:szCs w:val="22"/>
+        </w:rPr>
+        <w:t xml:space="preserve">egyenrangú</w:t>
+      </w:r>
+      <w:r>
+        <w:rPr>
+          <w:rFonts w:ascii="Calibri" w:cs="Calibri" w:eastAsia="Calibri" w:hAnsi="Calibri"/>
+          <w:sz w:val="22"/>
+          <w:szCs w:val="22"/>
+        </w:rPr>
+        <w:t xml:space="preserve">, nincs előre bejelölt opció – ezt az európai adatvédelmi irányelvek kifejezetten elvárják.</w:t>
       </w:r>
     </w:p>
     <w:p>
@@ -2861,7 +3007,91 @@
           <w:sz w:val="22"/>
           <w:szCs w:val="22"/>
         </w:rPr>
-        <w:t xml:space="preserve">beágyazott YouTube-videó, chatablak, közösségimédia-beágyazás.</w:t>
+        <w:t xml:space="preserve">Az oldal </w:t>
+      </w:r>
+      <w:r>
+        <w:rPr>
+          <w:rFonts w:ascii="Calibri" w:cs="Calibri" w:eastAsia="Calibri" w:hAnsi="Calibri"/>
+          <w:b/>
+          <w:bCs/>
+          <w:sz w:val="22"/>
+          <w:szCs w:val="22"/>
+        </w:rPr>
+        <w:t xml:space="preserve">nem használ</w:t>
+      </w:r>
+      <w:r>
+        <w:rPr>
+          <w:rFonts w:ascii="Calibri" w:cs="Calibri" w:eastAsia="Calibri" w:hAnsi="Calibri"/>
+          <w:sz w:val="22"/>
+          <w:szCs w:val="22"/>
+        </w:rPr>
+        <w:t xml:space="preserve"> látogatottság-mérő vagy hirdetési sütit, ezért a sáv csak a térképről kérdez.</w:t>
+      </w:r>
+    </w:p>
+    <w:p>
+      <w:pPr>
+        <w:pStyle w:val="ListParagraph"/>
+        <w:numPr>
+          <w:ilvl w:val="0"/>
+          <w:numId w:val="2"/>
+        </w:numPr>
+        <w:spacing w:after="80" w:line="276"/>
+      </w:pPr>
+      <w:r>
+        <w:rPr>
+          <w:rFonts w:ascii="Calibri" w:cs="Calibri" w:eastAsia="Calibri" w:hAnsi="Calibri"/>
+          <w:sz w:val="22"/>
+          <w:szCs w:val="22"/>
+        </w:rPr>
+        <w:t xml:space="preserve">A süti-kezelés leírása az </w:t>
+      </w:r>
+      <w:r>
+        <w:rPr>
+          <w:rFonts w:ascii="Calibri" w:cs="Calibri" w:eastAsia="Calibri" w:hAnsi="Calibri"/>
+          <w:b/>
+          <w:bCs/>
+          <w:sz w:val="22"/>
+          <w:szCs w:val="22"/>
+        </w:rPr>
+        <w:t xml:space="preserve">Adatkezelési tájékoztató „Sütik és külső szolgáltatások”</w:t>
+      </w:r>
+      <w:r>
+        <w:rPr>
+          <w:rFonts w:ascii="Calibri" w:cs="Calibri" w:eastAsia="Calibri" w:hAnsi="Calibri"/>
+          <w:sz w:val="22"/>
+          <w:szCs w:val="22"/>
+        </w:rPr>
+        <w:t xml:space="preserve"> fejezetében szerepel.</w:t>
+      </w:r>
+    </w:p>
+    <w:p>
+      <w:pPr>
+        <w:pStyle w:val="Heading2"/>
+        <w:spacing w:after="120" w:before="240"/>
+      </w:pPr>
+      <w:r>
+        <w:rPr>
+          <w:rFonts w:ascii="Calibri" w:cs="Calibri" w:eastAsia="Calibri" w:hAnsi="Calibri"/>
+          <w:b/>
+          <w:bCs/>
+          <w:color w:val="1F3A5F"/>
+          <w:sz w:val="24"/>
+          <w:szCs w:val="24"/>
+        </w:rPr>
+        <w:t xml:space="preserve">Mikor változna?</w:t>
+      </w:r>
+    </w:p>
+    <w:p>
+      <w:pPr>
+        <w:spacing w:after="120" w:line="288"/>
+      </w:pPr>
+      <w:r>
+        <w:rPr>
+          <w:rFonts w:ascii="Calibri" w:cs="Calibri" w:eastAsia="Calibri" w:hAnsi="Calibri"/>
+          <w:sz w:val="22"/>
+          <w:szCs w:val="22"/>
+        </w:rPr>
+        <w:t xml:space="preserve">Ha később látogatottság-mérés (pl. Google Analytics), hirdetéskövetés (pl. Facebook-pixel), YouTube-videó vagy chatablak kerül az oldalra, az automatikusan megjelenik a süti-sávban és a beállításokban, és a tájékoztatót is kiegészítjük.</w:t>
       </w:r>
     </w:p>
     <w:p>
@@ -2915,7 +3145,7 @@
                 <w:sz w:val="24"/>
                 <w:szCs w:val="24"/>
               </w:rPr>
-              <w:t xml:space="preserve">Kérjük, jelölje döntését</w:t>
+              <w:t xml:space="preserve">Kérjük, jelölje</w:t>
             </w:r>
           </w:p>
           <w:p>
@@ -2938,7 +3168,7 @@
                 <w:sz w:val="22"/>
                 <w:szCs w:val="22"/>
               </w:rPr>
-              <w:t xml:space="preserve">Egyetértek a javaslattal:</w:t>
+              <w:t xml:space="preserve">A jelenlegi megoldás megfelel</w:t>
             </w:r>
             <w:r>
               <w:rPr>
@@ -2946,7 +3176,7 @@
                 <w:sz w:val="22"/>
                 <w:szCs w:val="22"/>
               </w:rPr>
-              <w:t xml:space="preserve"> térkép kattintásra, betűtípus saját tárhelyről, süti-ablak nincs.</w:t>
+              <w:t xml:space="preserve"> – látogatottság-mérésre nincs szükségünk.</w:t>
             </w:r>
           </w:p>
           <w:p>
@@ -2977,7 +3207,7 @@
                 <w:sz w:val="22"/>
                 <w:szCs w:val="22"/>
               </w:rPr>
-              <w:t xml:space="preserve"> (pl. Google Analytics) – ebben az esetben süti-ablakot építünk be.</w:t>
+              <w:t xml:space="preserve"> (pl. Google Analytics) – ezt beépítjük a süti-sávba.</w:t>
             </w:r>
           </w:p>
         </w:tc>
@@ -3010,7 +3240,7 @@
           <w:sz w:val="22"/>
           <w:szCs w:val="22"/>
         </w:rPr>
-        <w:t xml:space="preserve">Elég, ha a kitöltött dokumentumot visszaküldi, vagy e-mailben megírja a hiányzó adatokat, a „nem” jelölésű pontokhoz egy-egy rövid megjegyzést és a süti-döntést. A beérkezett adatokkal a két oldalt véglegesítjük, és élesítés előtt még egyszer megmutatjuk.</w:t>
+        <w:t xml:space="preserve">Elég, ha a kitöltött dokumentumot visszaküldi, vagy e-mailben megírja a hiányzó adatokat, a „nem” jelölésű pontokhoz egy-egy rövid megjegyzést, valamint a 4. fejezet jelölését. A beérkezett adatokkal a két oldalt véglegesítjük, és élesítés előtt még egyszer megmutatjuk.</w:t>
       </w:r>
     </w:p>
     <w:sectPr>

</xml_diff>